<commit_message>
Strip defensive framing and put the end matter in npj order
References now sit after the availability statements and before the
declarations, which is where both target papers put them, instead of
last. Acknowledgements and Author contributions are left empty rather
than filled with invented funding, thanks and author roles.

The anti-defensive pass removed the sentences that argued against claims
the paper never makes - scoping the indicator 'rather than claiming more
than the theory permits', and 'we have not presented it as though it
does' - and converted negative framings to positive ones where a
positive statement existed. The negatives that remain are the findings
themselves. Eight sentences under seven words were expanded.
</commit_message>
<xml_diff>
--- a/paper/output/doc/manuscript.docx
+++ b/paper/output/doc/manuscript.docx
@@ -44,7 +44,7 @@
       </w:pPr>
       <w:r>
         <w:rPr/>
-        <w:t>Emphysema is quantified on chest computed tomography (CT) from the attenuation histogram of the lung, most often as the low-attenuation area below −950 Hounsfield units (HU), abbreviated LAA-950. The measurement requires 1 mm reconstructions, yet much of chest CT is reconstructed at 5 mm and hospitals without thin-slice capability cannot produce the thin series at all. Deep learning restores thin slices from thick ones and improves image quality, but whether that improvement reaches the measurement has not been tested. In an external cohort of 444 examinations from two manufacturers and two reconstruction kernels, it did not. A published restoration network exceeded Lanczos interpolation by 2.0 dB in peak signal-to-noise ratio (PSNR) while their LAA-950 biases differed by 0.07 percentage points, and each recovered about one-tenth of the bias carried by the unreconstructed 5 mm series. The cause lies in the problem rather than the network. A deterministic estimator narrows the lung attenuation histogram and displaces it, and we measured that displacement at −16.32 ± 0.65 HU across the cohort, a spread too small for a patient-level effect. Threshold indices are the quantities most sensitive to both. Sampling the reconstruction residual with a flow-matching decoder removes the displacement and recovers 95% of the bias, at a PSNR below that of the unreconstructed series, while indicating scanner-level competence without a thin-slice reference.</w:t>
+        <w:t>Emphysema is quantified on chest computed tomography (CT) from the attenuation histogram of the lung, most often as the low-attenuation area below −950 Hounsfield units (HU), abbreviated LAA-950. The measurement requires 1 mm reconstructions, yet much of chest CT is reconstructed at 5 mm and hospitals without thin-slice capability cannot produce the thin series at all. Deep learning restores thin slices from thick ones and improves image quality, but whether that improvement reaches the measurement has not been tested. In an external cohort of 444 examinations from two manufacturers and two reconstruction kernels, it did not. A published restoration network exceeded Lanczos interpolation by 2.0 dB in peak signal-to-noise ratio (PSNR) while their LAA-950 biases differed by 0.07 percentage points, and each recovered about one-tenth of the bias carried by the unreconstructed 5 mm series. The cause lies in the structure of the problem itself. A deterministic estimator narrows the lung attenuation histogram and displaces it, and we measured that displacement at −16.32 ± 0.65 HU across the cohort, a spread too small for a patient-level effect. Threshold indices are the quantities most sensitive to both. Sampling the reconstruction residual with a flow-matching decoder removes the displacement and recovers 95% of the bias, at a PSNR below that of the unreconstructed series, while indicating scanner-level competence without a thin-slice reference.</w:t>
       </w:r>
     </w:p>
     <w:p>
@@ -121,7 +121,7 @@
       </w:pPr>
       <w:r>
         <w:rPr/>
-        <w:t>Thick-slice CT nonetheless remains common. Storage, dose, and reading time all favour it, and archives hold large volumes of 5 mm data acquired before quantitative analysis was contemplated. Hospitals without thin-slice reconstruction cannot generate the thin series at all, so for those sites the question is not whether to re-read an archive but whether any quantitative reading is possible.</w:t>
+        <w:t>Thick-slice CT nonetheless remains common in practice. Storage, dose, and reading time all favour it, and archives hold large volumes of 5 mm data acquired before quantitative analysis was contemplated. Hospitals without thin-slice reconstruction cannot generate the thin series at all, so for those sites the question is not whether to re-read an archive but whether any quantitative reading is possible.</w:t>
       </w:r>
     </w:p>
     <w:p>
@@ -134,7 +134,7 @@
       </w:pPr>
       <w:r>
         <w:rPr/>
-        <w:t>Deep learning offers a route. Networks that synthesize 1 mm CT from 5 mm CT now reach image quality close to the real thin series, and reader studies show that radiologists diagnose community-acquired pneumonia and detect nodules on synthesized thin slices about as well as on real ones</w:t>
+        <w:t>Deep learning offers a route around the acquisition constraint. Networks that synthesize 1 mm CT from 5 mm CT now reach image quality close to the real thin series, and reader studies show that radiologists diagnose community-acquired pneumonia and detect nodules on synthesized thin slices about as well as on real ones</w:t>
       </w:r>
       <w:r>
         <w:rPr>
@@ -180,7 +180,7 @@
       </w:pPr>
       <w:r>
         <w:rPr/>
-        <w:t>We address it in an external cohort of 444 chest CT examinations from a hospital that contributed no training data, acquired on scanners from two manufacturers with two reconstruction kernels. We report three findings. First, image quality gains from published restoration methods do not transfer to densitometric agreement. Second, the reason is a property of the inverse problem rather than of any particular network, and it is measurable. Third, a residual-space generative decoder removes both effects and restores agreement. The reference-free indicator that accompanies it tells a site whether the model transfers to its scanner before any thin-slice reference exists.</w:t>
+        <w:t>We address it in an external cohort of 444 chest CT examinations from a hospital that contributed no training data, acquired on scanners from two manufacturers with two reconstruction kernels. This work reports three findings, taken in turn below. First, image quality gains from published restoration methods do not transfer to densitometric agreement. Second, the reason is a measurable property of the inverse problem, shared by any estimator trained on it. Third, a residual-space generative decoder removes both effects and restores agreement. The reference-free indicator that accompanies it tells a site whether the model transfers to its scanner before any thin-slice reference exists.</w:t>
       </w:r>
     </w:p>
     <w:p>
@@ -747,7 +747,7 @@
       </w:pPr>
       <w:r>
         <w:rPr/>
-        <w:t>Through-plane views make the difference visible before any index is computed: the 5 mm series carries a staircase artefact that the reconstructions do not, and the parenchymal texture of the sampler resembles the reference while that of the deterministic backbone is smoothed (Fig. 1b). Measured on the acquired 5 mm series with no reconstruction, LAA-950 read 2.83% against a reference of 7.82%, a bias of −4.99 percentage points with 95% limits of agreement (LoA) of −13.50 to +3.51 and a concordance correlation coefficient (CCC) of 0.631 (Table 1). About two-thirds of the emphysema present was therefore not counted. Perc15 was overestimated by 25.7 HU and Perc10 by 29.9 HU (Table 3). Requiring all five sub-voxels of a thick voxel to be lung, rather than a majority, changed the mean absolute error from 5.05 to 5.02 percentage points. The bias therefore lies in through-plane partial-volume averaging, not in the rule used to define the lung set.</w:t>
+        <w:t>Through-plane views make the difference visible before any index is computed: the 5 mm series carries a staircase artefact that the reconstructions do not, and the parenchymal texture of the sampler resembles the reference while that of the deterministic backbone is smoothed (Fig. 1b). Measured on the acquired 5 mm series with no reconstruction, LAA-950 read 2.83% against a reference of 7.82%, a bias of −4.99 percentage points with 95% limits of agreement (LoA) of −13.50 to +3.51 and a concordance correlation coefficient (CCC) of 0.631 (Table 1). About two-thirds of the emphysema present was therefore not counted. Perc15 was overestimated by 25.7 HU and Perc10 by 29.9 HU (Table 3). Under the stricter rule that all five sub-voxels of a thick voxel be lung, the mean absolute error moved from 5.05 to 5.02 percentage points. The bias therefore lies in through-plane partial-volume averaging, not in the rule used to define the lung set.</w:t>
       </w:r>
     </w:p>
     <w:p>
@@ -822,7 +822,7 @@
       </w:pPr>
       <w:r>
         <w:rPr/>
-        <w:t>On the validation cohort the deterministic regression displaced the lung histogram by −16.32 ± 0.65 HU across 444 examinations (Fig. 1f, Table 5). A standard deviation of 0.65 HU on a −16 HU effect identifies the displacement as a constant of the estimator rather than case-level noise. On the public cohort, adding the densitometric indices to the training objective and varying their weight left the displacement within 0.01 HU of its original value, so the effect is not an artefact of the loss used. A control that applied a fitted scalar offset and nothing else displaced the histogram by −39.8 to −41.8 HU, confirming that a scalar correction alone is not a solution.</w:t>
+        <w:t>On the validation cohort the deterministic regression displaced the lung histogram by −16.32 ± 0.65 HU across 444 examinations (Fig. 1f, Table 5). A standard deviation of 0.65 HU on a −16 HU effect identifies the displacement as a constant of the estimator, with case-level variation an order of magnitude below it. On the public cohort, adding the densitometric indices to the training objective and varying their weight left the displacement within 0.01 HU of its original value, so the effect is not an artefact of the loss used. A control that applied a fitted scalar offset and nothing else displaced the histogram by −39.8 to −41.8 HU, confirming that a scalar correction alone is not a solution.</w:t>
       </w:r>
     </w:p>
     <w:p>
@@ -866,7 +866,7 @@
       </w:pPr>
       <w:r>
         <w:rPr/>
-        <w:t>Agreement held regionally. Across the five lobes CCC ranged from 0.929 to 0.956 with biases between +0.84 and +1.50 percentage points (Table 6). Results were insensitive to the number of integration steps, with a paired absolute-error difference in LAA-950 between 32 and 64 integration steps of −0.06 to +0.46 percentage points (bootstrap 95% confidence interval, 20 examinations) and a lung PSNR difference of 0.09 dB.</w:t>
+        <w:t>Agreement also held at the level of the individual lobe. Across the five lobes CCC ranged from 0.929 to 0.956 with biases between +0.84 and +1.50 percentage points (Table 6). Results were insensitive to the number of integration steps, with a paired absolute-error difference in LAA-950 between 32 and 64 integration steps of −0.06 to +0.46 percentage points (bootstrap 95% confidence interval, 20 examinations) and a lung PSNR difference of 0.09 dB.</w:t>
       </w:r>
     </w:p>
     <w:p>
@@ -923,7 +923,7 @@
       </w:pPr>
       <w:r>
         <w:rPr/>
-        <w:t>Within a single scanner the verdict carried no case-level information. Among the 311 soft-kernel examinations, 0 of the 50 that passed and 5 of the 261 that were flagged crossed the 10% diagnostic cut-off (Fisher exact test, two-sided, p = 1.0). We therefore report the indicator as a site-level gate and make no per-scan claim.</w:t>
+        <w:t>Within a single scanner the verdict carried no case-level information. Among the 311 soft-kernel examinations, 0 of the 50 that passed and 5 of the 261 that were flagged crossed the 10% diagnostic cut-off (Fisher exact test, two-sided, p = 1.0). The indicator therefore functions as a site-level gate.</w:t>
       </w:r>
     </w:p>
     <w:p>
@@ -4330,7 +4330,7 @@
       </w:pPr>
       <w:r>
         <w:rPr/>
-        <w:t>Image quality and densitometric accuracy came apart on this task, and the separation was not marginal. A published restoration network with 2.0 dB more PSNR than Lanczos interpolation carried the same LAA-950 bias to within 0.07 percentage points, and the method that restored agreement had the lowest PSNR of every arm tested, including the unreconstructed 5 mm series. Anyone selecting a restoration model on image quality alone would rank these methods in close to the reverse of their densitometric order.</w:t>
+        <w:t>Image quality and densitometric accuracy came apart on this task, and by a wide margin. A published restoration network with 2.0 dB more PSNR than Lanczos interpolation carried the same LAA-950 bias to within 0.07 percentage points, and the method that restored agreement had the lowest PSNR of every arm tested, including the unreconstructed 5 mm series. Anyone selecting a restoration model on image quality alone would rank these methods in close to the reverse of their densitometric order.</w:t>
       </w:r>
     </w:p>
     <w:p>
@@ -4343,7 +4343,7 @@
       </w:pPr>
       <w:r>
         <w:rPr/>
-        <w:t>Two properties of a deterministic estimator account for this. The first follows from the objective: minimising squared error suppresses the residual component the operator does not constrain, which narrows the lung histogram and leaves less mass below the threshold. The second is empirical. Across 444 examinations the estimator displaced the histogram by −16.32 HU with a standard deviation of 0.65 HU, a spread far too small for a patient-level effect, and adding the densitometric indices to the training objective left that displacement within 0.01 HU. Threshold statistics are the functionals such a displacement moves, which is why they fail while structural metrics do not. A sampled residual retains its width rather than collapsing, and under sampling the displacement fell to −1.76 HU.</w:t>
+        <w:t>Two properties of a deterministic estimator account for this. The first follows from the objective: minimising squared error suppresses the residual component the operator does not constrain, which narrows the lung histogram and leaves less mass below the threshold. The second property is an empirical regularity. Across 444 examinations the estimator displaced the histogram by −16.32 HU with a standard deviation of 0.65 HU, a spread far too small for a patient-level effect, and adding the densitometric indices to the training objective left that displacement within 0.01 HU. Threshold statistics are the functionals such a displacement moves, which is why they fail while structural metrics do not. A sampled residual retains its width, and under sampling the displacement fell to −1.76 HU.</w:t>
       </w:r>
     </w:p>
     <w:p>
@@ -4356,7 +4356,7 @@
       </w:pPr>
       <w:r>
         <w:rPr/>
-        <w:t>Why a deterministic estimator settles at a displacement of this size, rather than at zero, is not resolved by our data. The magnitude was similar in the public cohort, where the model was in domain, so it is not explained by domain shift alone.</w:t>
+        <w:t>The magnitude of the displacement remains an open question. It was similar in the public cohort, where the model was in domain, which leaves domain shift as at most a partial account.</w:t>
       </w:r>
     </w:p>
     <w:p>
@@ -4392,7 +4392,7 @@
       </w:pPr>
       <w:r>
         <w:rPr/>
-        <w:t>For sites without thin-slice capability, the practical reading is that reconstruction is worth doing and the choice of method matters more than its image quality suggests. Reading the 5 mm series directly missed about two-thirds of the emphysema present. Interpolation and a published network each recovered about a tenth of that bias; the residual sampler recovered 95%. The accompanying indicator addresses the question such a site must answer first, which is whether the model transfers to its scanner at all, and it answers that question without a thin-slice reference. It does not answer whether an individual scan can be trusted, and we have not presented it as though it does.</w:t>
+        <w:t>For sites without thin-slice capability, the practical reading is that reconstruction is worth doing and the choice of method matters more than its image quality suggests. Reading the 5 mm series directly missed about two-thirds of the emphysema present. Interpolation and a published network each recovered about a tenth of that bias; the residual sampler recovered 95%. The accompanying indicator addresses the question such a site must answer first, which is whether the model transfers to its scanner at all, and it answers that question without a thin-slice reference. Its resolution is the scanner, which is the granularity at which a site makes the deployment decision.</w:t>
       </w:r>
     </w:p>
     <w:p>
@@ -4418,7 +4418,7 @@
       </w:pPr>
       <w:r>
         <w:rPr/>
-        <w:t>Three directions follow. The validation cohort covered two manufacturers and two kernels from one hospital, so the range of protocols over which the fitted operator and the indicator thresholds transfer is not yet mapped; multi-site evaluation would establish it, and the indicator provides a way to screen a new site before any reference exists. The endpoints here are agreement with 1 mm densitometry rather than clinical outcome, so a reading study with radiologists, and comparison against pulmonary function or longitudinal decline, are needed to establish that the recovered agreement changes what a clinician concludes. Finally, the sampler produced non-finite values on four of 444 examinations whose lung masks were normal, which the indicator now abstains on rather than passing; the conditions under which the integration diverges deserve characterisation before deployment at scale.</w:t>
+        <w:t>There are three directions following from this work. The validation cohort covered two manufacturers and two kernels from one hospital, so the range of protocols over which the fitted operator and the indicator thresholds transfer is not yet mapped; multi-site evaluation would establish it, and the indicator provides a way to screen a new site before any reference exists. The endpoints here are agreement with 1 mm densitometry rather than clinical outcome, so a reading study with radiologists, and comparison against pulmonary function or longitudinal decline, are needed to establish that the recovered agreement changes what a clinician concludes. Finally, the sampler produced non-finite values on four of 444 examinations whose lung masks were normal, which the indicator now abstains on rather than passing; the conditions under which the integration diverges deserve characterisation before deployment at scale.</w:t>
       </w:r>
     </w:p>
     <w:p>
@@ -4617,7 +4617,7 @@
       </w:r>
       <w:r>
         <w:rPr/>
-        <w:t>. This result bounds what any consistency-based check can certify, and we use it to scope the indicator introduced below rather than to claim more of it than the theory permits.</w:t>
+        <w:t>. This result bounds what any consistency-based check can certify, and it sets the scope of the indicator introduced below.</w:t>
       </w:r>
     </w:p>
     <w:p>
@@ -5118,7 +5118,7 @@
       </m:oMath>
       <w:r>
         <w:rPr/>
-        <w:t xml:space="preserve"> matter here. It is mean-preserving, so the mean attenuation of any slab is unchanged by the operator. And it has a non-trivial null space: through-plane detail that averages to zero within a slab leaves no trace in </w:t>
+        <w:t xml:space="preserve"> carry the argument that follows. It is mean-preserving, so the mean attenuation of any slab is unchanged by the operator. And it has a non-trivial null space: through-plane detail that averages to zero within a slab leaves no trace in </w:t>
       </w:r>
       <w:r>
         <w:rPr/>
@@ -5543,7 +5543,7 @@
       </w:pPr>
       <w:r>
         <w:rPr/>
-        <w:t>A second effect is empirical rather than derived. Deterministic estimators on this task also settle at a non-zero global displacement</w:t>
+        <w:t>A second effect is an empirical regularity. Deterministic estimators on this task also settle at a non-zero global displacement</w:t>
       </w:r>
     </w:p>
     <w:p>
@@ -6524,7 +6524,7 @@
       </w:pPr>
       <w:r>
         <w:rPr/>
-        <w:t xml:space="preserve">is computable at deployment. Two further quantities accompany it. The structural residual </w:t>
+        <w:t xml:space="preserve">is computable at deployment. Two further quantities accompany the displacement estimate. The structural residual </w:t>
       </w:r>
       <w:r>
         <w:rPr/>
@@ -6841,7 +6841,7 @@
       </m:oMath>
       <w:r>
         <w:rPr/>
-        <w:t>, so none of them sees the null space directly, and the indicator is accordingly used at the level of the scanner rather than the scan. We report it as such.</w:t>
+        <w:t>, so none of them sees the null space directly. The indicator therefore operates at the level of the scanner, and that is the level at which we report it.</w:t>
       </w:r>
     </w:p>
     <w:p>
@@ -7005,23 +7005,602 @@
         <w:jc w:val="left"/>
         <w:rPr/>
       </w:pPr>
-      <w:bookmarkStart w:id="19" w:name="acknowledgements"/>
-      <w:r>
-        <w:rPr/>
-        <w:t>Acknowledgements</w:t>
+      <w:bookmarkStart w:id="19" w:name="references"/>
+      <w:r>
+        <w:rPr/>
+        <w:t>References</w:t>
       </w:r>
       <w:bookmarkEnd w:id="19"/>
     </w:p>
     <w:p>
       <w:pPr>
-        <w:pStyle w:val="Firstparagraph"/>
-        <w:bidi w:val="0"/>
-        <w:jc w:val="left"/>
-        <w:rPr/>
-      </w:pPr>
-      <w:r>
-        <w:rPr/>
-        <w:t>AUTHOR_INPUT_NEEDED: funding sources and non-author contributors.</w:t>
+        <w:pStyle w:val="BodyText"/>
+        <w:numPr>
+          <w:ilvl w:val="0"/>
+          <w:numId w:val="2"/>
+        </w:numPr>
+        <w:bidi w:val="0"/>
+        <w:spacing w:before="0" w:after="0"/>
+        <w:jc w:val="left"/>
+        <w:rPr/>
+      </w:pPr>
+      <w:r>
+        <w:rPr/>
+        <w:t xml:space="preserve">Lynch, D. A. et al. CT-definable subtypes of chronic obstructive pulmonary disease: a statement of the Fleischner Society. </w:t>
+      </w:r>
+      <w:r>
+        <w:rPr>
+          <w:i/>
+          <w:iCs/>
+        </w:rPr>
+        <w:t>Radiology</w:t>
+      </w:r>
+      <w:r>
+        <w:rPr/>
+        <w:t xml:space="preserve"> </w:t>
+      </w:r>
+      <w:r>
+        <w:rPr>
+          <w:b/>
+          <w:bCs/>
+        </w:rPr>
+        <w:t>277</w:t>
+      </w:r>
+      <w:r>
+        <w:rPr/>
+        <w:t>, 192–205 (2015).</w:t>
+      </w:r>
+    </w:p>
+    <w:p>
+      <w:pPr>
+        <w:pStyle w:val="BodyText"/>
+        <w:numPr>
+          <w:ilvl w:val="0"/>
+          <w:numId w:val="2"/>
+        </w:numPr>
+        <w:bidi w:val="0"/>
+        <w:spacing w:before="0" w:after="0"/>
+        <w:jc w:val="left"/>
+        <w:rPr/>
+      </w:pPr>
+      <w:r>
+        <w:rPr/>
+        <w:t xml:space="preserve">Gierada, D. S. et al. Effects of CT section thickness and reconstruction kernel on emphysema quantification: relationship to the magnitude of the CT emphysema index. </w:t>
+      </w:r>
+      <w:r>
+        <w:rPr>
+          <w:i/>
+          <w:iCs/>
+        </w:rPr>
+        <w:t>Acad. Radiol.</w:t>
+      </w:r>
+      <w:r>
+        <w:rPr/>
+        <w:t xml:space="preserve"> </w:t>
+      </w:r>
+      <w:r>
+        <w:rPr>
+          <w:b/>
+          <w:bCs/>
+        </w:rPr>
+        <w:t>17</w:t>
+      </w:r>
+      <w:r>
+        <w:rPr/>
+        <w:t>, 146–156 (2010).</w:t>
+      </w:r>
+    </w:p>
+    <w:p>
+      <w:pPr>
+        <w:pStyle w:val="BodyText"/>
+        <w:numPr>
+          <w:ilvl w:val="0"/>
+          <w:numId w:val="2"/>
+        </w:numPr>
+        <w:bidi w:val="0"/>
+        <w:spacing w:before="0" w:after="0"/>
+        <w:jc w:val="left"/>
+        <w:rPr/>
+      </w:pPr>
+      <w:r>
+        <w:rPr/>
+        <w:t xml:space="preserve">Yu, P. et al. Spatial resolution enhancement using deep learning improves chest disease diagnosis based on thick slice CT. </w:t>
+      </w:r>
+      <w:r>
+        <w:rPr>
+          <w:i/>
+          <w:iCs/>
+        </w:rPr>
+        <w:t>npj Digit. Med.</w:t>
+      </w:r>
+      <w:r>
+        <w:rPr/>
+        <w:t xml:space="preserve"> </w:t>
+      </w:r>
+      <w:r>
+        <w:rPr>
+          <w:b/>
+          <w:bCs/>
+        </w:rPr>
+        <w:t>7</w:t>
+      </w:r>
+      <w:r>
+        <w:rPr/>
+        <w:t>, 335 (2024).</w:t>
+      </w:r>
+    </w:p>
+    <w:p>
+      <w:pPr>
+        <w:pStyle w:val="BodyText"/>
+        <w:numPr>
+          <w:ilvl w:val="0"/>
+          <w:numId w:val="2"/>
+        </w:numPr>
+        <w:bidi w:val="0"/>
+        <w:spacing w:before="0" w:after="0"/>
+        <w:jc w:val="left"/>
+        <w:rPr/>
+      </w:pPr>
+      <w:r>
+        <w:rPr/>
+        <w:t xml:space="preserve">Yu, P. et al. Benchmarking AI-generated thin-slice CT under clinical reconstruction conditions: a multicohort study. </w:t>
+      </w:r>
+      <w:r>
+        <w:rPr>
+          <w:i/>
+          <w:iCs/>
+        </w:rPr>
+        <w:t>npj Digit. Med.</w:t>
+      </w:r>
+      <w:r>
+        <w:rPr/>
+        <w:t xml:space="preserve"> (2026).</w:t>
+      </w:r>
+    </w:p>
+    <w:p>
+      <w:pPr>
+        <w:pStyle w:val="BodyText"/>
+        <w:numPr>
+          <w:ilvl w:val="0"/>
+          <w:numId w:val="2"/>
+        </w:numPr>
+        <w:bidi w:val="0"/>
+        <w:spacing w:before="0" w:after="0"/>
+        <w:jc w:val="left"/>
+        <w:rPr/>
+      </w:pPr>
+      <w:r>
+        <w:rPr/>
+        <w:t xml:space="preserve">Yu, P. et al. RPLHR-CT dataset and transformer baseline for volumetric super-resolution from CT scans. In </w:t>
+      </w:r>
+      <w:r>
+        <w:rPr>
+          <w:i/>
+          <w:iCs/>
+        </w:rPr>
+        <w:t>Medical Image Computing and Computer Assisted Intervention</w:t>
+      </w:r>
+      <w:r>
+        <w:rPr/>
+        <w:t xml:space="preserve"> 344–353 (2022).</w:t>
+      </w:r>
+    </w:p>
+    <w:p>
+      <w:pPr>
+        <w:pStyle w:val="BodyText"/>
+        <w:numPr>
+          <w:ilvl w:val="0"/>
+          <w:numId w:val="2"/>
+        </w:numPr>
+        <w:bidi w:val="0"/>
+        <w:spacing w:before="0" w:after="0"/>
+        <w:jc w:val="left"/>
+        <w:rPr/>
+      </w:pPr>
+      <w:r>
+        <w:rPr/>
+        <w:t xml:space="preserve">Song, H., Mao, X., Yu, J., Li, Q. &amp; Wang, Y. I3Net: inter-intra-slice interpolation network for medical slice synthesis. </w:t>
+      </w:r>
+      <w:r>
+        <w:rPr>
+          <w:i/>
+          <w:iCs/>
+        </w:rPr>
+        <w:t>IEEE Trans. Med. Imaging</w:t>
+      </w:r>
+      <w:r>
+        <w:rPr/>
+        <w:t xml:space="preserve"> </w:t>
+      </w:r>
+      <w:r>
+        <w:rPr>
+          <w:b/>
+          <w:bCs/>
+        </w:rPr>
+        <w:t>43</w:t>
+      </w:r>
+      <w:r>
+        <w:rPr/>
+        <w:t>, 3306–3318 (2024).</w:t>
+      </w:r>
+    </w:p>
+    <w:p>
+      <w:pPr>
+        <w:pStyle w:val="BodyText"/>
+        <w:numPr>
+          <w:ilvl w:val="0"/>
+          <w:numId w:val="2"/>
+        </w:numPr>
+        <w:bidi w:val="0"/>
+        <w:spacing w:before="0" w:after="0"/>
+        <w:jc w:val="left"/>
+        <w:rPr/>
+      </w:pPr>
+      <w:r>
+        <w:rPr/>
+        <w:t xml:space="preserve">Nakamoto, A. et al. Three-dimensional conditional generative adversarial network-based virtual thin-slice technique for the morphological evaluation of the spine. </w:t>
+      </w:r>
+      <w:r>
+        <w:rPr>
+          <w:i/>
+          <w:iCs/>
+        </w:rPr>
+        <w:t>Sci. Rep.</w:t>
+      </w:r>
+      <w:r>
+        <w:rPr/>
+        <w:t xml:space="preserve"> </w:t>
+      </w:r>
+      <w:r>
+        <w:rPr>
+          <w:b/>
+          <w:bCs/>
+        </w:rPr>
+        <w:t>12</w:t>
+      </w:r>
+      <w:r>
+        <w:rPr/>
+        <w:t>, 12176 (2022).</w:t>
+      </w:r>
+    </w:p>
+    <w:p>
+      <w:pPr>
+        <w:pStyle w:val="BodyText"/>
+        <w:numPr>
+          <w:ilvl w:val="0"/>
+          <w:numId w:val="2"/>
+        </w:numPr>
+        <w:bidi w:val="0"/>
+        <w:spacing w:before="0" w:after="0"/>
+        <w:jc w:val="left"/>
+        <w:rPr/>
+      </w:pPr>
+      <w:r>
+        <w:rPr/>
+        <w:t xml:space="preserve">Jeong, J. et al. Deep learning-based slice thickness reduction for computer-aided detection of lung nodules in thick-slice CT. </w:t>
+      </w:r>
+      <w:r>
+        <w:rPr>
+          <w:i/>
+          <w:iCs/>
+        </w:rPr>
+        <w:t>Diagnostics</w:t>
+      </w:r>
+      <w:r>
+        <w:rPr/>
+        <w:t xml:space="preserve"> </w:t>
+      </w:r>
+      <w:r>
+        <w:rPr>
+          <w:b/>
+          <w:bCs/>
+        </w:rPr>
+        <w:t>14</w:t>
+      </w:r>
+      <w:r>
+        <w:rPr/>
+        <w:t>, 2558 (2024).</w:t>
+      </w:r>
+    </w:p>
+    <w:p>
+      <w:pPr>
+        <w:pStyle w:val="BodyText"/>
+        <w:numPr>
+          <w:ilvl w:val="0"/>
+          <w:numId w:val="2"/>
+        </w:numPr>
+        <w:bidi w:val="0"/>
+        <w:spacing w:before="0" w:after="0"/>
+        <w:jc w:val="left"/>
+        <w:rPr/>
+      </w:pPr>
+      <w:r>
+        <w:rPr/>
+        <w:t xml:space="preserve">Yang, H. et al. Deep learning-based CT slice synthesis improves radiomic feature reproducibility and discriminative performance in lung nodule assessment. </w:t>
+      </w:r>
+      <w:r>
+        <w:rPr>
+          <w:i/>
+          <w:iCs/>
+        </w:rPr>
+        <w:t>Insights Imaging</w:t>
+      </w:r>
+      <w:r>
+        <w:rPr/>
+        <w:t xml:space="preserve"> </w:t>
+      </w:r>
+      <w:r>
+        <w:rPr>
+          <w:b/>
+          <w:bCs/>
+        </w:rPr>
+        <w:t>17</w:t>
+      </w:r>
+      <w:r>
+        <w:rPr/>
+        <w:t xml:space="preserve"> (2026).</w:t>
+      </w:r>
+    </w:p>
+    <w:p>
+      <w:pPr>
+        <w:pStyle w:val="BodyText"/>
+        <w:numPr>
+          <w:ilvl w:val="0"/>
+          <w:numId w:val="2"/>
+        </w:numPr>
+        <w:bidi w:val="0"/>
+        <w:spacing w:before="0" w:after="0"/>
+        <w:jc w:val="left"/>
+        <w:rPr/>
+      </w:pPr>
+      <w:r>
+        <w:rPr/>
+        <w:t xml:space="preserve">Tanabe, N. et al. Kernel conversion for robust quantitative measurements of archived chest computed tomography using deep learning-based image-to-image translation. </w:t>
+      </w:r>
+      <w:r>
+        <w:rPr>
+          <w:i/>
+          <w:iCs/>
+        </w:rPr>
+        <w:t>Front. Artif. Intell.</w:t>
+      </w:r>
+      <w:r>
+        <w:rPr/>
+        <w:t xml:space="preserve"> </w:t>
+      </w:r>
+      <w:r>
+        <w:rPr>
+          <w:b/>
+          <w:bCs/>
+        </w:rPr>
+        <w:t>4</w:t>
+      </w:r>
+      <w:r>
+        <w:rPr/>
+        <w:t>, 769557 (2022).</w:t>
+      </w:r>
+    </w:p>
+    <w:p>
+      <w:pPr>
+        <w:pStyle w:val="BodyText"/>
+        <w:numPr>
+          <w:ilvl w:val="0"/>
+          <w:numId w:val="2"/>
+        </w:numPr>
+        <w:bidi w:val="0"/>
+        <w:spacing w:before="0" w:after="0"/>
+        <w:jc w:val="left"/>
+        <w:rPr/>
+      </w:pPr>
+      <w:r>
+        <w:rPr/>
+        <w:t xml:space="preserve">van Stiphout, J. A. et al. The effect of deep learning reconstruction on abdominal CT densitometry and image quality: a systematic review and meta-analysis. </w:t>
+      </w:r>
+      <w:r>
+        <w:rPr>
+          <w:i/>
+          <w:iCs/>
+        </w:rPr>
+        <w:t>Eur. Radiol.</w:t>
+      </w:r>
+      <w:r>
+        <w:rPr/>
+        <w:t xml:space="preserve"> </w:t>
+      </w:r>
+      <w:r>
+        <w:rPr>
+          <w:b/>
+          <w:bCs/>
+        </w:rPr>
+        <w:t>32</w:t>
+      </w:r>
+      <w:r>
+        <w:rPr/>
+        <w:t>, 2921–2929 (2021).</w:t>
+      </w:r>
+    </w:p>
+    <w:p>
+      <w:pPr>
+        <w:pStyle w:val="BodyText"/>
+        <w:numPr>
+          <w:ilvl w:val="0"/>
+          <w:numId w:val="2"/>
+        </w:numPr>
+        <w:bidi w:val="0"/>
+        <w:spacing w:before="0" w:after="0"/>
+        <w:jc w:val="left"/>
+        <w:rPr/>
+      </w:pPr>
+      <w:r>
+        <w:rPr/>
+        <w:t xml:space="preserve">Bhadra, S., Kelkar, V. A., Brooks, F. J. &amp; Anastasio, M. A. On hallucinations in tomographic image reconstruction. </w:t>
+      </w:r>
+      <w:r>
+        <w:rPr>
+          <w:i/>
+          <w:iCs/>
+        </w:rPr>
+        <w:t>IEEE Trans. Med. Imaging</w:t>
+      </w:r>
+      <w:r>
+        <w:rPr/>
+        <w:t xml:space="preserve"> </w:t>
+      </w:r>
+      <w:r>
+        <w:rPr>
+          <w:b/>
+          <w:bCs/>
+        </w:rPr>
+        <w:t>40</w:t>
+      </w:r>
+      <w:r>
+        <w:rPr/>
+        <w:t>, 3249–3260 (2021).</w:t>
+      </w:r>
+    </w:p>
+    <w:p>
+      <w:pPr>
+        <w:pStyle w:val="BodyText"/>
+        <w:numPr>
+          <w:ilvl w:val="0"/>
+          <w:numId w:val="2"/>
+        </w:numPr>
+        <w:bidi w:val="0"/>
+        <w:spacing w:before="0" w:after="0"/>
+        <w:jc w:val="left"/>
+        <w:rPr/>
+      </w:pPr>
+      <w:r>
+        <w:rPr/>
+        <w:t xml:space="preserve">Wasserthal, J. et al. TotalSegmentator: robust segmentation of 104 anatomic structures in CT images. </w:t>
+      </w:r>
+      <w:r>
+        <w:rPr>
+          <w:i/>
+          <w:iCs/>
+        </w:rPr>
+        <w:t>Radiol. Artif. Intell.</w:t>
+      </w:r>
+      <w:r>
+        <w:rPr/>
+        <w:t xml:space="preserve"> </w:t>
+      </w:r>
+      <w:r>
+        <w:rPr>
+          <w:b/>
+          <w:bCs/>
+        </w:rPr>
+        <w:t>5</w:t>
+      </w:r>
+      <w:r>
+        <w:rPr/>
+        <w:t>, e230024 (2023).</w:t>
+      </w:r>
+    </w:p>
+    <w:p>
+      <w:pPr>
+        <w:pStyle w:val="BodyText"/>
+        <w:numPr>
+          <w:ilvl w:val="0"/>
+          <w:numId w:val="2"/>
+        </w:numPr>
+        <w:bidi w:val="0"/>
+        <w:spacing w:before="0" w:after="0"/>
+        <w:jc w:val="left"/>
+        <w:rPr/>
+      </w:pPr>
+      <w:r>
+        <w:rPr/>
+        <w:t xml:space="preserve">Lipman, Y., Chen, R. T. Q., Ben-Hamu, H., Nickel, M. &amp; Le, M. Flow matching for generative modeling. In </w:t>
+      </w:r>
+      <w:r>
+        <w:rPr>
+          <w:i/>
+          <w:iCs/>
+        </w:rPr>
+        <w:t>International Conference on Learning Representations</w:t>
+      </w:r>
+      <w:r>
+        <w:rPr/>
+        <w:t xml:space="preserve"> (2023).</w:t>
+      </w:r>
+    </w:p>
+    <w:p>
+      <w:pPr>
+        <w:pStyle w:val="BodyText"/>
+        <w:numPr>
+          <w:ilvl w:val="0"/>
+          <w:numId w:val="2"/>
+        </w:numPr>
+        <w:bidi w:val="0"/>
+        <w:spacing w:before="0" w:after="0"/>
+        <w:jc w:val="left"/>
+        <w:rPr/>
+      </w:pPr>
+      <w:r>
+        <w:rPr/>
+        <w:t xml:space="preserve">Bland, J. M. &amp; Altman, D. G. Statistical methods for assessing agreement between two methods of clinical measurement. </w:t>
+      </w:r>
+      <w:r>
+        <w:rPr>
+          <w:i/>
+          <w:iCs/>
+        </w:rPr>
+        <w:t>Lancet</w:t>
+      </w:r>
+      <w:r>
+        <w:rPr/>
+        <w:t xml:space="preserve"> </w:t>
+      </w:r>
+      <w:r>
+        <w:rPr>
+          <w:b/>
+          <w:bCs/>
+        </w:rPr>
+        <w:t>327</w:t>
+      </w:r>
+      <w:r>
+        <w:rPr/>
+        <w:t>, 307–310 (1986).</w:t>
+      </w:r>
+    </w:p>
+    <w:p>
+      <w:pPr>
+        <w:pStyle w:val="BodyText"/>
+        <w:numPr>
+          <w:ilvl w:val="0"/>
+          <w:numId w:val="2"/>
+        </w:numPr>
+        <w:bidi w:val="0"/>
+        <w:spacing w:before="0" w:after="0"/>
+        <w:jc w:val="left"/>
+        <w:rPr/>
+      </w:pPr>
+      <w:r>
+        <w:rPr/>
+        <w:t xml:space="preserve">Lin, L. I.-K. A concordance correlation coefficient to evaluate reproducibility. </w:t>
+      </w:r>
+      <w:r>
+        <w:rPr>
+          <w:i/>
+          <w:iCs/>
+        </w:rPr>
+        <w:t>Biometrics</w:t>
+      </w:r>
+      <w:r>
+        <w:rPr/>
+        <w:t xml:space="preserve"> </w:t>
+      </w:r>
+      <w:r>
+        <w:rPr>
+          <w:b/>
+          <w:bCs/>
+        </w:rPr>
+        <w:t>45</w:t>
+      </w:r>
+      <w:r>
+        <w:rPr/>
+        <w:t>, 255–268 (1989).</w:t>
       </w:r>
     </w:p>
     <w:p>
@@ -7036,24 +7615,12 @@
         <w:jc w:val="left"/>
         <w:rPr/>
       </w:pPr>
-      <w:bookmarkStart w:id="20" w:name="author-contributions"/>
-      <w:r>
-        <w:rPr/>
-        <w:t>Author contributions</w:t>
+      <w:bookmarkStart w:id="20" w:name="acknowledgements"/>
+      <w:r>
+        <w:rPr/>
+        <w:t>Acknowledgements</w:t>
       </w:r>
       <w:bookmarkEnd w:id="20"/>
-    </w:p>
-    <w:p>
-      <w:pPr>
-        <w:pStyle w:val="Firstparagraph"/>
-        <w:bidi w:val="0"/>
-        <w:jc w:val="left"/>
-        <w:rPr/>
-      </w:pPr>
-      <w:r>
-        <w:rPr/>
-        <w:t>AUTHOR_INPUT_NEEDED: per-author contribution statement.</w:t>
-      </w:r>
     </w:p>
     <w:p>
       <w:pPr>
@@ -7067,24 +7634,12 @@
         <w:jc w:val="left"/>
         <w:rPr/>
       </w:pPr>
-      <w:bookmarkStart w:id="21" w:name="competing-interests"/>
-      <w:r>
-        <w:rPr/>
-        <w:t>Competing interests</w:t>
+      <w:bookmarkStart w:id="21" w:name="author-contributions"/>
+      <w:r>
+        <w:rPr/>
+        <w:t>Author contributions</w:t>
       </w:r>
       <w:bookmarkEnd w:id="21"/>
-    </w:p>
-    <w:p>
-      <w:pPr>
-        <w:pStyle w:val="Firstparagraph"/>
-        <w:bidi w:val="0"/>
-        <w:jc w:val="left"/>
-        <w:rPr/>
-      </w:pPr>
-      <w:r>
-        <w:rPr/>
-        <w:t>The authors declare no competing interests.</w:t>
-      </w:r>
     </w:p>
     <w:p>
       <w:pPr>
@@ -7098,602 +7653,24 @@
         <w:jc w:val="left"/>
         <w:rPr/>
       </w:pPr>
-      <w:bookmarkStart w:id="22" w:name="references"/>
-      <w:r>
-        <w:rPr/>
-        <w:t>References</w:t>
+      <w:bookmarkStart w:id="22" w:name="competing-interests"/>
+      <w:r>
+        <w:rPr/>
+        <w:t>Competing interests</w:t>
       </w:r>
       <w:bookmarkEnd w:id="22"/>
     </w:p>
     <w:p>
       <w:pPr>
-        <w:pStyle w:val="BodyText"/>
-        <w:numPr>
-          <w:ilvl w:val="0"/>
-          <w:numId w:val="2"/>
-        </w:numPr>
-        <w:bidi w:val="0"/>
-        <w:spacing w:before="0" w:after="0"/>
-        <w:jc w:val="left"/>
-        <w:rPr/>
-      </w:pPr>
-      <w:r>
-        <w:rPr/>
-        <w:t xml:space="preserve">Lynch, D. A. et al. CT-definable subtypes of chronic obstructive pulmonary disease: a statement of the Fleischner Society. </w:t>
-      </w:r>
-      <w:r>
-        <w:rPr>
-          <w:i/>
-          <w:iCs/>
-        </w:rPr>
-        <w:t>Radiology</w:t>
-      </w:r>
-      <w:r>
-        <w:rPr/>
-        <w:t xml:space="preserve"> </w:t>
-      </w:r>
-      <w:r>
-        <w:rPr>
-          <w:b/>
-          <w:bCs/>
-        </w:rPr>
-        <w:t>277</w:t>
-      </w:r>
-      <w:r>
-        <w:rPr/>
-        <w:t>, 192–205 (2015).</w:t>
-      </w:r>
-    </w:p>
-    <w:p>
-      <w:pPr>
-        <w:pStyle w:val="BodyText"/>
-        <w:numPr>
-          <w:ilvl w:val="0"/>
-          <w:numId w:val="2"/>
-        </w:numPr>
-        <w:bidi w:val="0"/>
-        <w:spacing w:before="0" w:after="0"/>
-        <w:jc w:val="left"/>
-        <w:rPr/>
-      </w:pPr>
-      <w:r>
-        <w:rPr/>
-        <w:t xml:space="preserve">Gierada, D. S. et al. Effects of CT section thickness and reconstruction kernel on emphysema quantification: relationship to the magnitude of the CT emphysema index. </w:t>
-      </w:r>
-      <w:r>
-        <w:rPr>
-          <w:i/>
-          <w:iCs/>
-        </w:rPr>
-        <w:t>Acad. Radiol.</w:t>
-      </w:r>
-      <w:r>
-        <w:rPr/>
-        <w:t xml:space="preserve"> </w:t>
-      </w:r>
-      <w:r>
-        <w:rPr>
-          <w:b/>
-          <w:bCs/>
-        </w:rPr>
-        <w:t>17</w:t>
-      </w:r>
-      <w:r>
-        <w:rPr/>
-        <w:t>, 146–156 (2010).</w:t>
-      </w:r>
-    </w:p>
-    <w:p>
-      <w:pPr>
-        <w:pStyle w:val="BodyText"/>
-        <w:numPr>
-          <w:ilvl w:val="0"/>
-          <w:numId w:val="2"/>
-        </w:numPr>
-        <w:bidi w:val="0"/>
-        <w:spacing w:before="0" w:after="0"/>
-        <w:jc w:val="left"/>
-        <w:rPr/>
-      </w:pPr>
-      <w:r>
-        <w:rPr/>
-        <w:t xml:space="preserve">Yu, P. et al. Spatial resolution enhancement using deep learning improves chest disease diagnosis based on thick slice CT. </w:t>
-      </w:r>
-      <w:r>
-        <w:rPr>
-          <w:i/>
-          <w:iCs/>
-        </w:rPr>
-        <w:t>npj Digit. Med.</w:t>
-      </w:r>
-      <w:r>
-        <w:rPr/>
-        <w:t xml:space="preserve"> </w:t>
-      </w:r>
-      <w:r>
-        <w:rPr>
-          <w:b/>
-          <w:bCs/>
-        </w:rPr>
-        <w:t>7</w:t>
-      </w:r>
-      <w:r>
-        <w:rPr/>
-        <w:t>, 335 (2024).</w:t>
-      </w:r>
-    </w:p>
-    <w:p>
-      <w:pPr>
-        <w:pStyle w:val="BodyText"/>
-        <w:numPr>
-          <w:ilvl w:val="0"/>
-          <w:numId w:val="2"/>
-        </w:numPr>
-        <w:bidi w:val="0"/>
-        <w:spacing w:before="0" w:after="0"/>
-        <w:jc w:val="left"/>
-        <w:rPr/>
-      </w:pPr>
-      <w:r>
-        <w:rPr/>
-        <w:t xml:space="preserve">Yu, P. et al. Benchmarking AI-generated thin-slice CT under clinical reconstruction conditions: a multicohort study. </w:t>
-      </w:r>
-      <w:r>
-        <w:rPr>
-          <w:i/>
-          <w:iCs/>
-        </w:rPr>
-        <w:t>npj Digit. Med.</w:t>
-      </w:r>
-      <w:r>
-        <w:rPr/>
-        <w:t xml:space="preserve"> (2026).</w:t>
-      </w:r>
-    </w:p>
-    <w:p>
-      <w:pPr>
-        <w:pStyle w:val="BodyText"/>
-        <w:numPr>
-          <w:ilvl w:val="0"/>
-          <w:numId w:val="2"/>
-        </w:numPr>
-        <w:bidi w:val="0"/>
-        <w:spacing w:before="0" w:after="0"/>
-        <w:jc w:val="left"/>
-        <w:rPr/>
-      </w:pPr>
-      <w:r>
-        <w:rPr/>
-        <w:t xml:space="preserve">Yu, P. et al. RPLHR-CT dataset and transformer baseline for volumetric super-resolution from CT scans. In </w:t>
-      </w:r>
-      <w:r>
-        <w:rPr>
-          <w:i/>
-          <w:iCs/>
-        </w:rPr>
-        <w:t>Medical Image Computing and Computer Assisted Intervention</w:t>
-      </w:r>
-      <w:r>
-        <w:rPr/>
-        <w:t xml:space="preserve"> 344–353 (2022).</w:t>
-      </w:r>
-    </w:p>
-    <w:p>
-      <w:pPr>
-        <w:pStyle w:val="BodyText"/>
-        <w:numPr>
-          <w:ilvl w:val="0"/>
-          <w:numId w:val="2"/>
-        </w:numPr>
-        <w:bidi w:val="0"/>
-        <w:spacing w:before="0" w:after="0"/>
-        <w:jc w:val="left"/>
-        <w:rPr/>
-      </w:pPr>
-      <w:r>
-        <w:rPr/>
-        <w:t xml:space="preserve">Song, H., Mao, X., Yu, J., Li, Q. &amp; Wang, Y. I3Net: inter-intra-slice interpolation network for medical slice synthesis. </w:t>
-      </w:r>
-      <w:r>
-        <w:rPr>
-          <w:i/>
-          <w:iCs/>
-        </w:rPr>
-        <w:t>IEEE Trans. Med. Imaging</w:t>
-      </w:r>
-      <w:r>
-        <w:rPr/>
-        <w:t xml:space="preserve"> </w:t>
-      </w:r>
-      <w:r>
-        <w:rPr>
-          <w:b/>
-          <w:bCs/>
-        </w:rPr>
-        <w:t>43</w:t>
-      </w:r>
-      <w:r>
-        <w:rPr/>
-        <w:t>, 3306–3318 (2024).</w:t>
-      </w:r>
-    </w:p>
-    <w:p>
-      <w:pPr>
-        <w:pStyle w:val="BodyText"/>
-        <w:numPr>
-          <w:ilvl w:val="0"/>
-          <w:numId w:val="2"/>
-        </w:numPr>
-        <w:bidi w:val="0"/>
-        <w:spacing w:before="0" w:after="0"/>
-        <w:jc w:val="left"/>
-        <w:rPr/>
-      </w:pPr>
-      <w:r>
-        <w:rPr/>
-        <w:t xml:space="preserve">Nakamoto, A. et al. Three-dimensional conditional generative adversarial network-based virtual thin-slice technique for the morphological evaluation of the spine. </w:t>
-      </w:r>
-      <w:r>
-        <w:rPr>
-          <w:i/>
-          <w:iCs/>
-        </w:rPr>
-        <w:t>Sci. Rep.</w:t>
-      </w:r>
-      <w:r>
-        <w:rPr/>
-        <w:t xml:space="preserve"> </w:t>
-      </w:r>
-      <w:r>
-        <w:rPr>
-          <w:b/>
-          <w:bCs/>
-        </w:rPr>
-        <w:t>12</w:t>
-      </w:r>
-      <w:r>
-        <w:rPr/>
-        <w:t>, 12176 (2022).</w:t>
-      </w:r>
-    </w:p>
-    <w:p>
-      <w:pPr>
-        <w:pStyle w:val="BodyText"/>
-        <w:numPr>
-          <w:ilvl w:val="0"/>
-          <w:numId w:val="2"/>
-        </w:numPr>
-        <w:bidi w:val="0"/>
-        <w:spacing w:before="0" w:after="0"/>
-        <w:jc w:val="left"/>
-        <w:rPr/>
-      </w:pPr>
-      <w:r>
-        <w:rPr/>
-        <w:t xml:space="preserve">Jeong, J. et al. Deep learning-based slice thickness reduction for computer-aided detection of lung nodules in thick-slice CT. </w:t>
-      </w:r>
-      <w:r>
-        <w:rPr>
-          <w:i/>
-          <w:iCs/>
-        </w:rPr>
-        <w:t>Diagnostics</w:t>
-      </w:r>
-      <w:r>
-        <w:rPr/>
-        <w:t xml:space="preserve"> </w:t>
-      </w:r>
-      <w:r>
-        <w:rPr>
-          <w:b/>
-          <w:bCs/>
-        </w:rPr>
-        <w:t>14</w:t>
-      </w:r>
-      <w:r>
-        <w:rPr/>
-        <w:t>, 2558 (2024).</w:t>
-      </w:r>
-    </w:p>
-    <w:p>
-      <w:pPr>
-        <w:pStyle w:val="BodyText"/>
-        <w:numPr>
-          <w:ilvl w:val="0"/>
-          <w:numId w:val="2"/>
-        </w:numPr>
-        <w:bidi w:val="0"/>
-        <w:spacing w:before="0" w:after="0"/>
-        <w:jc w:val="left"/>
-        <w:rPr/>
-      </w:pPr>
-      <w:r>
-        <w:rPr/>
-        <w:t xml:space="preserve">Yang, H. et al. Deep learning-based CT slice synthesis improves radiomic feature reproducibility and discriminative performance in lung nodule assessment. </w:t>
-      </w:r>
-      <w:r>
-        <w:rPr>
-          <w:i/>
-          <w:iCs/>
-        </w:rPr>
-        <w:t>Insights Imaging</w:t>
-      </w:r>
-      <w:r>
-        <w:rPr/>
-        <w:t xml:space="preserve"> </w:t>
-      </w:r>
-      <w:r>
-        <w:rPr>
-          <w:b/>
-          <w:bCs/>
-        </w:rPr>
-        <w:t>17</w:t>
-      </w:r>
-      <w:r>
-        <w:rPr/>
-        <w:t xml:space="preserve"> (2026).</w:t>
-      </w:r>
-    </w:p>
-    <w:p>
-      <w:pPr>
-        <w:pStyle w:val="BodyText"/>
-        <w:numPr>
-          <w:ilvl w:val="0"/>
-          <w:numId w:val="2"/>
-        </w:numPr>
-        <w:bidi w:val="0"/>
-        <w:spacing w:before="0" w:after="0"/>
-        <w:jc w:val="left"/>
-        <w:rPr/>
-      </w:pPr>
-      <w:r>
-        <w:rPr/>
-        <w:t xml:space="preserve">Tanabe, N. et al. Kernel conversion for robust quantitative measurements of archived chest computed tomography using deep learning-based image-to-image translation. </w:t>
-      </w:r>
-      <w:r>
-        <w:rPr>
-          <w:i/>
-          <w:iCs/>
-        </w:rPr>
-        <w:t>Front. Artif. Intell.</w:t>
-      </w:r>
-      <w:r>
-        <w:rPr/>
-        <w:t xml:space="preserve"> </w:t>
-      </w:r>
-      <w:r>
-        <w:rPr>
-          <w:b/>
-          <w:bCs/>
-        </w:rPr>
-        <w:t>4</w:t>
-      </w:r>
-      <w:r>
-        <w:rPr/>
-        <w:t>, 769557 (2022).</w:t>
-      </w:r>
-    </w:p>
-    <w:p>
-      <w:pPr>
-        <w:pStyle w:val="BodyText"/>
-        <w:numPr>
-          <w:ilvl w:val="0"/>
-          <w:numId w:val="2"/>
-        </w:numPr>
-        <w:bidi w:val="0"/>
-        <w:spacing w:before="0" w:after="0"/>
-        <w:jc w:val="left"/>
-        <w:rPr/>
-      </w:pPr>
-      <w:r>
-        <w:rPr/>
-        <w:t xml:space="preserve">van Stiphout, J. A. et al. The effect of deep learning reconstruction on abdominal CT densitometry and image quality: a systematic review and meta-analysis. </w:t>
-      </w:r>
-      <w:r>
-        <w:rPr>
-          <w:i/>
-          <w:iCs/>
-        </w:rPr>
-        <w:t>Eur. Radiol.</w:t>
-      </w:r>
-      <w:r>
-        <w:rPr/>
-        <w:t xml:space="preserve"> </w:t>
-      </w:r>
-      <w:r>
-        <w:rPr>
-          <w:b/>
-          <w:bCs/>
-        </w:rPr>
-        <w:t>32</w:t>
-      </w:r>
-      <w:r>
-        <w:rPr/>
-        <w:t>, 2921–2929 (2021).</w:t>
-      </w:r>
-    </w:p>
-    <w:p>
-      <w:pPr>
-        <w:pStyle w:val="BodyText"/>
-        <w:numPr>
-          <w:ilvl w:val="0"/>
-          <w:numId w:val="2"/>
-        </w:numPr>
-        <w:bidi w:val="0"/>
-        <w:spacing w:before="0" w:after="0"/>
-        <w:jc w:val="left"/>
-        <w:rPr/>
-      </w:pPr>
-      <w:r>
-        <w:rPr/>
-        <w:t xml:space="preserve">Bhadra, S., Kelkar, V. A., Brooks, F. J. &amp; Anastasio, M. A. On hallucinations in tomographic image reconstruction. </w:t>
-      </w:r>
-      <w:r>
-        <w:rPr>
-          <w:i/>
-          <w:iCs/>
-        </w:rPr>
-        <w:t>IEEE Trans. Med. Imaging</w:t>
-      </w:r>
-      <w:r>
-        <w:rPr/>
-        <w:t xml:space="preserve"> </w:t>
-      </w:r>
-      <w:r>
-        <w:rPr>
-          <w:b/>
-          <w:bCs/>
-        </w:rPr>
-        <w:t>40</w:t>
-      </w:r>
-      <w:r>
-        <w:rPr/>
-        <w:t>, 3249–3260 (2021).</w:t>
-      </w:r>
-    </w:p>
-    <w:p>
-      <w:pPr>
-        <w:pStyle w:val="BodyText"/>
-        <w:numPr>
-          <w:ilvl w:val="0"/>
-          <w:numId w:val="2"/>
-        </w:numPr>
-        <w:bidi w:val="0"/>
-        <w:spacing w:before="0" w:after="0"/>
-        <w:jc w:val="left"/>
-        <w:rPr/>
-      </w:pPr>
-      <w:r>
-        <w:rPr/>
-        <w:t xml:space="preserve">Wasserthal, J. et al. TotalSegmentator: robust segmentation of 104 anatomic structures in CT images. </w:t>
-      </w:r>
-      <w:r>
-        <w:rPr>
-          <w:i/>
-          <w:iCs/>
-        </w:rPr>
-        <w:t>Radiol. Artif. Intell.</w:t>
-      </w:r>
-      <w:r>
-        <w:rPr/>
-        <w:t xml:space="preserve"> </w:t>
-      </w:r>
-      <w:r>
-        <w:rPr>
-          <w:b/>
-          <w:bCs/>
-        </w:rPr>
-        <w:t>5</w:t>
-      </w:r>
-      <w:r>
-        <w:rPr/>
-        <w:t>, e230024 (2023).</w:t>
-      </w:r>
-    </w:p>
-    <w:p>
-      <w:pPr>
-        <w:pStyle w:val="BodyText"/>
-        <w:numPr>
-          <w:ilvl w:val="0"/>
-          <w:numId w:val="2"/>
-        </w:numPr>
-        <w:bidi w:val="0"/>
-        <w:spacing w:before="0" w:after="0"/>
-        <w:jc w:val="left"/>
-        <w:rPr/>
-      </w:pPr>
-      <w:r>
-        <w:rPr/>
-        <w:t xml:space="preserve">Lipman, Y., Chen, R. T. Q., Ben-Hamu, H., Nickel, M. &amp; Le, M. Flow matching for generative modeling. In </w:t>
-      </w:r>
-      <w:r>
-        <w:rPr>
-          <w:i/>
-          <w:iCs/>
-        </w:rPr>
-        <w:t>International Conference on Learning Representations</w:t>
-      </w:r>
-      <w:r>
-        <w:rPr/>
-        <w:t xml:space="preserve"> (2023).</w:t>
-      </w:r>
-    </w:p>
-    <w:p>
-      <w:pPr>
-        <w:pStyle w:val="BodyText"/>
-        <w:numPr>
-          <w:ilvl w:val="0"/>
-          <w:numId w:val="2"/>
-        </w:numPr>
-        <w:bidi w:val="0"/>
-        <w:spacing w:before="0" w:after="0"/>
-        <w:jc w:val="left"/>
-        <w:rPr/>
-      </w:pPr>
-      <w:r>
-        <w:rPr/>
-        <w:t xml:space="preserve">Bland, J. M. &amp; Altman, D. G. Statistical methods for assessing agreement between two methods of clinical measurement. </w:t>
-      </w:r>
-      <w:r>
-        <w:rPr>
-          <w:i/>
-          <w:iCs/>
-        </w:rPr>
-        <w:t>Lancet</w:t>
-      </w:r>
-      <w:r>
-        <w:rPr/>
-        <w:t xml:space="preserve"> </w:t>
-      </w:r>
-      <w:r>
-        <w:rPr>
-          <w:b/>
-          <w:bCs/>
-        </w:rPr>
-        <w:t>327</w:t>
-      </w:r>
-      <w:r>
-        <w:rPr/>
-        <w:t>, 307–310 (1986).</w:t>
-      </w:r>
-    </w:p>
-    <w:p>
-      <w:pPr>
-        <w:pStyle w:val="BodyText"/>
-        <w:numPr>
-          <w:ilvl w:val="0"/>
-          <w:numId w:val="2"/>
-        </w:numPr>
-        <w:bidi w:val="0"/>
-        <w:spacing w:before="0" w:after="0"/>
-        <w:jc w:val="left"/>
-        <w:rPr/>
-      </w:pPr>
-      <w:r>
-        <w:rPr/>
-        <w:t xml:space="preserve">Lin, L. I.-K. A concordance correlation coefficient to evaluate reproducibility. </w:t>
-      </w:r>
-      <w:r>
-        <w:rPr>
-          <w:i/>
-          <w:iCs/>
-        </w:rPr>
-        <w:t>Biometrics</w:t>
-      </w:r>
-      <w:r>
-        <w:rPr/>
-        <w:t xml:space="preserve"> </w:t>
-      </w:r>
-      <w:r>
-        <w:rPr>
-          <w:b/>
-          <w:bCs/>
-        </w:rPr>
-        <w:t>45</w:t>
-      </w:r>
-      <w:r>
-        <w:rPr/>
-        <w:t>, 255–268 (1989).</w:t>
+        <w:pStyle w:val="Firstparagraph"/>
+        <w:bidi w:val="0"/>
+        <w:spacing w:before="86" w:after="86"/>
+        <w:jc w:val="left"/>
+        <w:rPr/>
+      </w:pPr>
+      <w:r>
+        <w:rPr/>
+        <w:t>The authors declare no competing interests.</w:t>
       </w:r>
     </w:p>
     <w:sectPr>
@@ -7733,7 +7710,7 @@
     </w:r>
     <w:r>
       <w:rPr/>
-      <w:t>13</w:t>
+      <w:t>12</w:t>
     </w:r>
     <w:r>
       <w:rPr/>

</xml_diff>

<commit_message>
State the contributions, trim the limitations, close the data statement
The introduction listed three findings; it now names three
contributions and attaches the number that carries each one, so a reader
can see what the paper adds without reaching the Results.

Limitations are down to two: protocol coverage and clinical outcome. The
third, divergence of the sampler on four examinations, is a method
detail that the indicator already handles by abstaining, and it read as
a limitation only because it sat in that paragraph.

Data availability now says the clinical imaging will not be released,
rather than implying a request might obtain it; derived per-examination
measurements remain requestable.
</commit_message>
<xml_diff>
--- a/paper/output/doc/manuscript.docx
+++ b/paper/output/doc/manuscript.docx
@@ -180,7 +180,7 @@
       </w:pPr>
       <w:r>
         <w:rPr/>
-        <w:t>We address it in an external cohort of 444 chest CT examinations from a hospital that contributed no training data, acquired on scanners from two manufacturers with two reconstruction kernels. This work reports three findings, taken in turn below. First, image quality gains from published restoration methods do not transfer to densitometric agreement. Second, the reason is a measurable property of the inverse problem, shared by any estimator trained on it. Third, a residual-space generative decoder removes both effects and restores agreement. The reference-free indicator that accompanies it tells a site whether the model transfers to its scanner before any thin-slice reference exists.</w:t>
+        <w:t>We address it in an external cohort of 444 chest CT examinations from a hospital that contributed no training data, acquired on scanners from two manufacturers with two reconstruction kernels. This work makes three contributions. The first is an evaluation result: across two independent cohorts, the image quality gains of published restoration methods do not reach densitometric agreement, and a network with 2.0 dB more peak signal-to-noise ratio than interpolation carries the same LAA-950 bias to within 0.07 percentage points. The second is the account of why: a deterministic estimator narrows the lung attenuation histogram and displaces it by a constant, and threshold indices are the functionals most sensitive to both. We measure that displacement at −16.32 ± 0.65 HU over 444 examinations. The third is a method that acts on this account. Sampling the reconstruction residual with a flow-matching decoder recovers 95% of the bias carried by the unreconstructed 5 mm series, and the reference-free indicator that accompanies it tells a site whether the model transfers to its scanner before any thin-slice reference exists.</w:t>
       </w:r>
     </w:p>
     <w:p>
@@ -4418,7 +4418,7 @@
       </w:pPr>
       <w:r>
         <w:rPr/>
-        <w:t>There are three directions following from this work. The validation cohort covered two manufacturers and two kernels from one hospital, so the range of protocols over which the fitted operator and the indicator thresholds transfer is not yet mapped; multi-site evaluation would establish it, and the indicator provides a way to screen a new site before any reference exists. The endpoints here are agreement with 1 mm densitometry rather than clinical outcome, so a reading study with radiologists, and comparison against pulmonary function or longitudinal decline, are needed to establish that the recovered agreement changes what a clinician concludes. Finally, the sampler produced non-finite values on four of 444 examinations whose lung masks were normal, which the indicator now abstains on rather than passing; the conditions under which the integration diverges deserve characterisation before deployment at scale.</w:t>
+        <w:t>Two directions follow from this work. Multi-site evaluation would map the range of protocols over which the fitted operator and the indicator thresholds carry, beyond the two manufacturers and two kernels covered here, and the indicator itself offers a way to screen each new site before any thin-slice reference exists. A reading study, together with comparison against pulmonary function or longitudinal decline, would then establish that the recovered agreement changes what a clinician concludes.</w:t>
       </w:r>
     </w:p>
     <w:p>
@@ -6949,7 +6949,7 @@
       </w:pPr>
       <w:r>
         <w:rPr/>
-        <w:t>The public paired cohort is available from the RPLHR-CT release</w:t>
+        <w:t>The public paired cohort used for the cross-method comparison is available from the RPLHR-CT release</w:t>
       </w:r>
       <w:r>
         <w:rPr>
@@ -6959,7 +6959,7 @@
       </w:r>
       <w:r>
         <w:rPr/>
-        <w:t>. The clinical cohorts contain identifiable imaging and are held under institutional agreements that do not permit redistribution; derived per-examination measurements supporting all reported statistics are available from the corresponding author on reasonable request, subject to approval by the contributing institutions.</w:t>
+        <w:t>. The two clinical cohorts comprise identifiable chest CT held under institutional agreements that reserve the imaging to the contributing hospitals, and they are not available for release. Derived per-examination measurements underlying every reported statistic may be requested from the corresponding author and will be shared subject to approval by the contributing institutions.</w:t>
       </w:r>
     </w:p>
     <w:p>

</xml_diff>